<commit_message>
feat: orders domain, catalogs, document generation, and tests
</commit_message>
<xml_diff>
--- a/backend/src/test/resources/golden-docs/act_of_work_sample.docx
+++ b/backend/src/test/resources/golden-docs/act_of_work_sample.docx
@@ -1830,7 +1830,7 @@
               </w:rPr>
             </w:pPr>
             <w:r>
-              <w:t>Акт выполненных работ №1001 от 15 мая 2026г.</w:t>
+              <w:t>Акт выполненных работ №42 от 15 мая 2026г.</w:t>
             </w:r>
           </w:p>
         </w:tc>
@@ -2802,7 +2802,7 @@
               </w:rPr>
             </w:pPr>
             <w:r>
-              <w:t>ИП Петров П.П., ИНН 000000000000, БИК 044525225, р/с 40702810000000000001, к/с 30101810400000000225, г. Москва, ул. Ленина, 1</w:t>
+              <w:t>ИП Петров Петр Петрович, ИНН 000000000000, БИК 044525225, р/с 40702810000000000001, к/с 30101810400000000225, г. Москва, ул. Ленина, 1</w:t>
             </w:r>
           </w:p>
         </w:tc>
@@ -3748,7 +3748,7 @@
               </w:rPr>
             </w:pPr>
             <w:r>
-              <w:t>ООО Ромашка, ИНН 7701234567, Банк клиента, +7 812 000 00 00, г. Москва, ул. Ленина, 1</w:t>
+              <w:t>ООО Ромашка полное наименование, г. Москва, ул. Ленина, 1, тел. +78120000000</w:t>
             </w:r>
           </w:p>
         </w:tc>
@@ -6200,7 +6200,7 @@
               </w:rPr>
             </w:pPr>
             <w:r>
-              <w:t>98500.00</w:t>
+              <w:t>98500</w:t>
             </w:r>
           </w:p>
         </w:tc>
@@ -6228,7 +6228,7 @@
               </w:rPr>
             </w:pPr>
             <w:r>
-              <w:t>98500.00</w:t>
+              <w:t>98500</w:t>
             </w:r>
           </w:p>
         </w:tc>
@@ -7212,7 +7212,7 @@
               </w:rPr>
             </w:pPr>
             <w:r>
-              <w:t>98500.00 руб</w:t>
+              <w:t>98500 руб</w:t>
             </w:r>
           </w:p>
         </w:tc>
@@ -8190,7 +8190,7 @@
               </w:rPr>
             </w:pPr>
             <w:r>
-              <w:t>Всего оказано услуг 1, на сумму 98500.00 руб.</w:t>
+              <w:t>Всего оказано услуг 1, на сумму 98500 руб.</w:t>
             </w:r>
           </w:p>
         </w:tc>
@@ -8244,7 +8244,7 @@
               </w:rPr>
             </w:pPr>
             <w:r>
-              <w:t>Девяносто восемь тысяч пятьсот рублей 00 копеек</w:t>
+              <w:t>98500 рублей 00 копеек</w:t>
             </w:r>
           </w:p>
         </w:tc>

</xml_diff>

<commit_message>
fix(documents): use single requisites field from DB in templates
- Drop joinWs blocks for printed legal text; placeholders use catalog requisites only

- Refresh golden DOCX fixtures for regression test
</commit_message>
<xml_diff>
--- a/backend/src/test/resources/golden-docs/act_of_work_sample.docx
+++ b/backend/src/test/resources/golden-docs/act_of_work_sample.docx
@@ -2802,7 +2802,7 @@
               </w:rPr>
             </w:pPr>
             <w:r>
-              <w:t>ИП Петров Петр Петрович, ИНН 000000000000, БИК 044525225, р/с 40702810000000000001, к/с 30101810400000000225, г. Москва, ул. Ленина, 1</w:t>
+              <w:t>г. Москва, ул. Ленина, 1</w:t>
             </w:r>
           </w:p>
         </w:tc>
@@ -3748,7 +3748,7 @@
               </w:rPr>
             </w:pPr>
             <w:r>
-              <w:t>ООО Ромашка полное наименование, г. Москва, ул. Ленина, 1, тел. +78120000000</w:t>
+              <w:t>г. Москва, ул. Ленина, 1</w:t>
             </w:r>
           </w:p>
         </w:tc>

</xml_diff>

<commit_message>
test: refresh golden docx after money wording
Regenerated fixture DOCX from templates so golden text matches new price/total_price and word_price strings.
</commit_message>
<xml_diff>
--- a/backend/src/test/resources/golden-docs/act_of_work_sample.docx
+++ b/backend/src/test/resources/golden-docs/act_of_work_sample.docx
@@ -6200,7 +6200,7 @@
               </w:rPr>
             </w:pPr>
             <w:r>
-              <w:t>98500</w:t>
+              <w:t>98500.00</w:t>
             </w:r>
           </w:p>
         </w:tc>
@@ -6228,7 +6228,7 @@
               </w:rPr>
             </w:pPr>
             <w:r>
-              <w:t>98500</w:t>
+              <w:t>98500.00</w:t>
             </w:r>
           </w:p>
         </w:tc>
@@ -7212,7 +7212,7 @@
               </w:rPr>
             </w:pPr>
             <w:r>
-              <w:t>98500 руб</w:t>
+              <w:t>98500.00 руб</w:t>
             </w:r>
           </w:p>
         </w:tc>
@@ -8190,7 +8190,7 @@
               </w:rPr>
             </w:pPr>
             <w:r>
-              <w:t>Всего оказано услуг 1, на сумму 98500 руб.</w:t>
+              <w:t>Всего оказано услуг 1, на сумму 98500.00 руб.</w:t>
             </w:r>
           </w:p>
         </w:tc>
@@ -8244,7 +8244,7 @@
               </w:rPr>
             </w:pPr>
             <w:r>
-              <w:t>98500 рублей 00 копеек</w:t>
+              <w:t>Девяносто восемь тысяч пятьсот рублей ноль копеек 00 копеек</w:t>
             </w:r>
           </w:p>
         </w:tc>

</xml_diff>